<commit_message>
version bump 3.3.8 -> 3.3.9
Synchronous with iclo 3.3.9 (rename refactor). act itself is not
touched by the rename; only DESCRIPTION version and date updated.

Also included: pending uncommitted work from earlier sessions
(annotations, tiers, transcripts, search, export, helpers, examples,
resources etc.) captured in this commit.

Co-Authored-By: Claude Opus 4.6 <noreply@anthropic.com>
</commit_message>
<xml_diff>
--- a/inst/extdata/docx/template_transcript.docx
+++ b/inst/extdata/docx/template_transcript.docx
@@ -960,8 +960,8 @@
       <w:sz w:val="20"/>
     </w:rPr>
   </w:style>
-  <w:style w:type="paragraph" w:customStyle="1" w:styleId="transcriptbodydefault">
-    <w:name w:val="transcript_body_default"/>
+  <w:style w:type="paragraph" w:customStyle="1" w:styleId="transcriptdefault">
+    <w:name w:val="transcript_default"/>
     <w:basedOn w:val="transcriptheadertitle"/>
     <w:qFormat/>
     <w:rsid w:val="00933E15"/>
@@ -969,10 +969,10 @@
       <w:rFonts w:ascii="Courier New" w:hAnsi="Courier New"/>
     </w:rPr>
   </w:style>
-  <w:style w:type="paragraph" w:customStyle="1" w:styleId="transcriptbodytranslation">
-    <w:name w:val="transcript_body_translation"/>
-    <w:basedOn w:val="transcriptbodydefault"/>
-    <w:next w:val="transcriptbodydefault"/>
+  <w:style w:type="paragraph" w:customStyle="1" w:styleId="transcripttranslation">
+    <w:name w:val="transcript_translation"/>
+    <w:basedOn w:val="transcriptdefault"/>
+    <w:next w:val="transcriptdefault"/>
     <w:qFormat/>
     <w:rsid w:val="00933E15"/>
     <w:rPr>
@@ -980,9 +980,9 @@
       <w:i/>
     </w:rPr>
   </w:style>
-  <w:style w:type="paragraph" w:customStyle="1" w:styleId="transcriptbodyspace">
-    <w:name w:val="transcript_body_space"/>
-    <w:basedOn w:val="transcriptbodytranslation"/>
+  <w:style w:type="paragraph" w:customStyle="1" w:styleId="transcriptspace">
+    <w:name w:val="transcript_space"/>
+    <w:basedOn w:val="transcripttranslation"/>
     <w:qFormat/>
     <w:rsid w:val="00933E15"/>
     <w:rPr>
@@ -1025,6 +1025,15 @@
     <w:rPr>
       <w:rFonts w:ascii="Courier New" w:hAnsi="Courier New"/>
       <w:sz w:val="20"/>
+    </w:rPr>
+  </w:style>
+  <w:style w:type="paragraph" w:customStyle="1" w:styleId="transcriptmultimodal">
+    <w:name w:val="transcript_multimodal"/>
+    <w:basedOn w:val="transcriptdefault"/>
+    <w:qFormat/>
+    <w:rsid w:val="005F01B2"/>
+    <w:rPr>
+      <w:b w:val="0"/>
     </w:rPr>
   </w:style>
 </w:styles>

</xml_diff>